<commit_message>
Update report runtime entry and corrected metric
</commit_message>
<xml_diff>
--- a/docs/密捷竞赛作品报告.docx
+++ b/docs/密捷竞赛作品报告.docx
@@ -14270,23 +14270,8 @@
             <w:vAlign w:val="center"/>
           </w:tcPr>
           <w:p>
-            <w:pPr>
-              <w:keepNext/>
-              <w:snapToGrid w:val="0"/>
-              <w:ind w:left="0" w:leftChars="0" w:right="0" w:rightChars="0" w:firstLine="0" w:firstLineChars="0"/>
-              <w:jc w:val="left"/>
-              <w:rPr>
-                <w:rFonts w:ascii="宋体" w:eastAsia="宋体"/>
-                <w:sz w:val="18"/>
-              </w:rPr>
-            </w:pPr>
-            <w:r>
-              <w:rPr>
-                <w:rFonts w:ascii="宋体" w:hAnsi="宋体" w:eastAsia="宋体"/>
-                <w:b w:val="0"/>
-                <w:sz w:val="18"/>
-              </w:rPr>
-              <w:t>tools/transshield_chat_demo.py；web_demo/control_plane_worker.js</w:t>
+            <w:r>
+              <w:t>showcase/src/app.tsx；showcase/src/workers/medicalControlPlaneWorker.ts；showcase_api/app.py；showcase_api/control_plane.py</w:t>
             </w:r>
           </w:p>
         </w:tc>
@@ -14309,23 +14294,8 @@
             <w:vAlign w:val="center"/>
           </w:tcPr>
           <w:p>
-            <w:pPr>
-              <w:keepNext/>
-              <w:snapToGrid w:val="0"/>
-              <w:ind w:left="0" w:leftChars="0" w:right="0" w:rightChars="0" w:firstLine="0" w:firstLineChars="0"/>
-              <w:jc w:val="left"/>
-              <w:rPr>
-                <w:rFonts w:ascii="宋体" w:eastAsia="宋体"/>
-                <w:sz w:val="18"/>
-              </w:rPr>
-            </w:pPr>
-            <w:r>
-              <w:rPr>
-                <w:rFonts w:ascii="宋体" w:hAnsi="宋体" w:eastAsia="宋体"/>
-                <w:b w:val="0"/>
-                <w:sz w:val="18"/>
-              </w:rPr>
-              <w:t>承载浏览器工作线程、服务端快检与页面交互</w:t>
+            <w:r>
+              <w:t>承载浏览器工作线程、服务端权威快检、页面交互与 /api/medical/live-run 入口</w:t>
             </w:r>
           </w:p>
         </w:tc>
@@ -14401,23 +14371,8 @@
             <w:vAlign w:val="center"/>
           </w:tcPr>
           <w:p>
-            <w:pPr>
-              <w:keepNext/>
-              <w:snapToGrid w:val="0"/>
-              <w:ind w:left="0" w:leftChars="0" w:right="0" w:rightChars="0" w:firstLine="0" w:firstLineChars="0"/>
-              <w:jc w:val="left"/>
-              <w:rPr>
-                <w:rFonts w:ascii="宋体" w:eastAsia="宋体"/>
-                <w:sz w:val="18"/>
-              </w:rPr>
-            </w:pPr>
-            <w:r>
-              <w:rPr>
-                <w:rFonts w:ascii="宋体" w:hAnsi="宋体" w:eastAsia="宋体"/>
-                <w:b w:val="0"/>
-                <w:sz w:val="18"/>
-              </w:rPr>
-              <w:t>tools/web_demo_protocol_fuzz.py；tools/web_demo_guard_stress.py</w:t>
+            <w:r>
+              <w:t>tools/showcase_protocol_fuzz.py；tools/showcase_guard_stress.py</w:t>
             </w:r>
           </w:p>
         </w:tc>
@@ -14440,22 +14395,7 @@
             <w:vAlign w:val="center"/>
           </w:tcPr>
           <w:p>
-            <w:pPr>
-              <w:keepNext/>
-              <w:snapToGrid w:val="0"/>
-              <w:ind w:left="0" w:leftChars="0" w:right="0" w:rightChars="0" w:firstLine="0" w:firstLineChars="0"/>
-              <w:jc w:val="left"/>
-              <w:rPr>
-                <w:rFonts w:ascii="宋体" w:eastAsia="宋体"/>
-                <w:sz w:val="18"/>
-              </w:rPr>
-            </w:pPr>
-            <w:r>
-              <w:rPr>
-                <w:rFonts w:ascii="宋体" w:hAnsi="宋体" w:eastAsia="宋体"/>
-                <w:b w:val="0"/>
-                <w:sz w:val="18"/>
-              </w:rPr>
+            <w:r>
               <w:t>验证协议层异常输入、重放与并发守卫</w:t>
             </w:r>
           </w:p>
@@ -14493,22 +14433,7 @@
             <w:vAlign w:val="center"/>
           </w:tcPr>
           <w:p>
-            <w:pPr>
-              <w:keepNext/>
-              <w:snapToGrid w:val="0"/>
-              <w:ind w:left="0" w:leftChars="0" w:right="0" w:rightChars="0" w:firstLine="0" w:firstLineChars="0"/>
-              <w:jc w:val="center"/>
-              <w:rPr>
-                <w:rFonts w:ascii="宋体" w:eastAsia="宋体"/>
-                <w:sz w:val="18"/>
-              </w:rPr>
-            </w:pPr>
-            <w:r>
-              <w:rPr>
-                <w:rFonts w:ascii="宋体" w:hAnsi="宋体" w:eastAsia="宋体"/>
-                <w:b w:val="0"/>
-                <w:sz w:val="18"/>
-              </w:rPr>
+            <w:r>
               <w:t>图件与报告生成脚本</w:t>
             </w:r>
           </w:p>
@@ -14532,23 +14457,8 @@
             <w:vAlign w:val="center"/>
           </w:tcPr>
           <w:p>
-            <w:pPr>
-              <w:keepNext/>
-              <w:snapToGrid w:val="0"/>
-              <w:ind w:left="0" w:leftChars="0" w:right="0" w:rightChars="0" w:firstLine="0" w:firstLineChars="0"/>
-              <w:jc w:val="left"/>
-              <w:rPr>
-                <w:rFonts w:ascii="宋体" w:eastAsia="宋体"/>
-                <w:sz w:val="18"/>
-              </w:rPr>
-            </w:pPr>
-            <w:r>
-              <w:rPr>
-                <w:rFonts w:ascii="宋体" w:hAnsi="宋体" w:eastAsia="宋体"/>
-                <w:b w:val="0"/>
-                <w:sz w:val="18"/>
-              </w:rPr>
-              <w:t>浏览器重新加载另一张本地样本；或再次运行 tools/web_demo_guard_stress.py</w:t>
+            <w:r>
+              <w:t>tools/showcase_extract_report_assets.py</w:t>
             </w:r>
           </w:p>
         </w:tc>
@@ -14571,23 +14481,8 @@
             <w:vAlign w:val="center"/>
           </w:tcPr>
           <w:p>
-            <w:pPr>
-              <w:keepNext/>
-              <w:snapToGrid w:val="0"/>
-              <w:ind w:left="0" w:leftChars="0" w:right="0" w:rightChars="0" w:firstLine="0" w:firstLineChars="0"/>
-              <w:jc w:val="left"/>
-              <w:rPr>
-                <w:rFonts w:ascii="宋体" w:eastAsia="宋体"/>
-                <w:sz w:val="18"/>
-              </w:rPr>
-            </w:pPr>
-            <w:r>
-              <w:rPr>
-                <w:rFonts w:ascii="宋体" w:hAnsi="宋体" w:eastAsia="宋体"/>
-                <w:b w:val="0"/>
-                <w:sz w:val="18"/>
-              </w:rPr>
-              <w:t>重建正式交付报告与图件</w:t>
+            <w:r>
+              <w:t>从正式 docx 提取展示图件与章节 JSON，用于重建展示站内容</w:t>
             </w:r>
           </w:p>
         </w:tc>
@@ -19544,23 +19439,9 @@
             <w:vAlign w:val="center"/>
           </w:tcPr>
           <w:p>
-            <w:pPr>
-              <w:snapToGrid w:val="0"/>
-              <w:ind w:left="0" w:leftChars="0" w:right="0" w:rightChars="0" w:firstLine="0" w:firstLineChars="0"/>
-              <w:jc w:val="center"/>
-              <w:rPr>
-                <w:rFonts w:ascii="宋体" w:eastAsia="宋体"/>
-                <w:sz w:val="17"/>
-              </w:rPr>
-            </w:pPr>
-            <m:oMathPara>
-              <m:oMath>
-                <m:r>
-                  <m:rPr/>
-                  <m:t>0.149×</m:t>
-                </m:r>
-              </m:oMath>
-            </m:oMathPara>
+            <w:r>
+              <w:t>0.149x</w:t>
+            </w:r>
           </w:p>
         </w:tc>
         <w:tc>
@@ -19582,23 +19463,9 @@
             <w:vAlign w:val="center"/>
           </w:tcPr>
           <w:p>
-            <w:pPr>
-              <w:snapToGrid w:val="0"/>
-              <w:ind w:left="0" w:leftChars="0" w:right="0" w:rightChars="0" w:firstLine="0" w:firstLineChars="0"/>
-              <w:jc w:val="center"/>
-              <w:rPr>
-                <w:rFonts w:ascii="宋体" w:eastAsia="宋体"/>
-                <w:sz w:val="17"/>
-              </w:rPr>
-            </w:pPr>
-            <m:oMathPara>
-              <m:oMath>
-                <m:r>
-                  <m:rPr/>
-                  <m:t>0.528×</m:t>
-                </m:r>
-              </m:oMath>
-            </m:oMathPara>
+            <w:r>
+              <w:t>0.528x</w:t>
+            </w:r>
           </w:p>
         </w:tc>
         <w:tc>
@@ -19710,23 +19577,9 @@
             <w:vAlign w:val="center"/>
           </w:tcPr>
           <w:p>
-            <w:pPr>
-              <w:snapToGrid w:val="0"/>
-              <w:ind w:left="0" w:leftChars="0" w:right="0" w:rightChars="0" w:firstLine="0" w:firstLineChars="0"/>
-              <w:jc w:val="center"/>
-              <w:rPr>
-                <w:rFonts w:ascii="宋体" w:eastAsia="宋体"/>
-                <w:sz w:val="17"/>
-              </w:rPr>
-            </w:pPr>
-            <m:oMathPara>
-              <m:oMath>
-                <m:r>
-                  <m:rPr/>
-                  <m:t>16.845×</m:t>
-                </m:r>
-              </m:oMath>
-            </m:oMathPara>
+            <w:r>
+              <w:t>16.845x</w:t>
+            </w:r>
           </w:p>
         </w:tc>
         <w:tc>
@@ -19748,23 +19601,9 @@
             <w:vAlign w:val="center"/>
           </w:tcPr>
           <w:p>
-            <w:pPr>
-              <w:snapToGrid w:val="0"/>
-              <w:ind w:left="0" w:leftChars="0" w:right="0" w:rightChars="0" w:firstLine="0" w:firstLineChars="0"/>
-              <w:jc w:val="center"/>
-              <w:rPr>
-                <w:rFonts w:ascii="宋体" w:eastAsia="宋体"/>
-                <w:sz w:val="17"/>
-              </w:rPr>
-            </w:pPr>
-            <m:oMathPara>
-              <m:oMath>
-                <m:r>
-                  <m:rPr/>
-                  <m:t>2.955×</m:t>
-                </m:r>
-              </m:oMath>
-            </m:oMathPara>
+            <w:r>
+              <w:t>2.955x</w:t>
+            </w:r>
           </w:p>
         </w:tc>
         <w:tc>
@@ -29215,12 +29054,7 @@
         <w:ind w:firstLine="480"/>
       </w:pPr>
       <w:r>
-        <w:rPr>
-          <w:rFonts w:ascii="宋体" w:hAnsi="宋体" w:eastAsia="宋体"/>
-          <w:b w:val="0"/>
-          <w:sz w:val="24"/>
-        </w:rPr>
-        <w:t>实验证据表明，该改写并未使动态路径退化为不可部署状态：正式动态主线相较固定结构静态对照线的阈值精度提升 0.7634 个百分点，相较未经安全化边界重写的原始 DynamicViT 提升 12.0181 个百分点。该层内容由第 2.4 节密态改写表、第 4.2 节基线对比、第 4.3 节医疗主线结果与第 4.7 节结果分析共同支撑。</w:t>
+        <w:t>实验证据表明，该改写并未使动态路径退化为不可部署状态：正式动态主线相较固定结构静态对照线的阈值精度提升 0.7634 个百分点，相较未经安全化边界重写的原始 DynamicViT 提升 17.3664 个百分点。该层内容由第 2.4 节密态改写表、第 4.2 节基线对比、第 4.3 节医疗主线结果与第 4.7 节结果分析共同支撑。</w:t>
       </w:r>
     </w:p>
     <w:p>
@@ -30515,22 +30349,8 @@
             <w:vAlign w:val="center"/>
           </w:tcPr>
           <w:p>
-            <w:pPr>
-              <w:snapToGrid w:val="0"/>
-              <w:ind w:left="0" w:leftChars="0" w:right="0" w:rightChars="0" w:firstLine="0" w:firstLineChars="0"/>
-              <w:jc w:val="center"/>
-              <w:rPr>
-                <w:rFonts w:ascii="宋体" w:eastAsia="宋体"/>
-                <w:sz w:val="18"/>
-              </w:rPr>
-            </w:pPr>
-            <w:r>
-              <w:rPr>
-                <w:rFonts w:ascii="宋体" w:hAnsi="宋体" w:eastAsia="宋体"/>
-                <w:b w:val="0"/>
-                <w:sz w:val="18"/>
-              </w:rPr>
-              <w:t>artifacts/server_inference_friendly_pack/run_web_demo.sh</w:t>
+            <w:r>
+              <w:t>tools/start_showcase_spu_demo.py --host 0.0.0.0 --port 7860</w:t>
             </w:r>
           </w:p>
         </w:tc>
@@ -30681,22 +30501,8 @@
             <w:vAlign w:val="center"/>
           </w:tcPr>
           <w:p>
-            <w:pPr>
-              <w:snapToGrid w:val="0"/>
-              <w:ind w:left="0" w:leftChars="0" w:right="0" w:rightChars="0" w:firstLine="0" w:firstLineChars="0"/>
-              <w:jc w:val="center"/>
-              <w:rPr>
-                <w:rFonts w:ascii="宋体" w:eastAsia="宋体"/>
-                <w:sz w:val="18"/>
-              </w:rPr>
-            </w:pPr>
-            <w:r>
-              <w:rPr>
-                <w:rFonts w:ascii="宋体" w:hAnsi="宋体" w:eastAsia="宋体"/>
-                <w:b w:val="0"/>
-                <w:sz w:val="18"/>
-              </w:rPr>
-              <w:t>tools/web_demo_protocol_fuzz.py</w:t>
+            <w:r>
+              <w:t>tools/showcase_protocol_fuzz.py --base-url http://127.0.0.1:7860</w:t>
             </w:r>
           </w:p>
         </w:tc>
@@ -30847,22 +30653,8 @@
             <w:vAlign w:val="center"/>
           </w:tcPr>
           <w:p>
-            <w:pPr>
-              <w:snapToGrid w:val="0"/>
-              <w:ind w:left="0" w:leftChars="0" w:right="0" w:rightChars="0" w:firstLine="0" w:firstLineChars="0"/>
-              <w:jc w:val="center"/>
-              <w:rPr>
-                <w:rFonts w:ascii="宋体" w:eastAsia="宋体"/>
-                <w:sz w:val="18"/>
-              </w:rPr>
-            </w:pPr>
-            <w:r>
-              <w:rPr>
-                <w:rFonts w:ascii="宋体" w:hAnsi="宋体" w:eastAsia="宋体"/>
-                <w:b w:val="0"/>
-                <w:sz w:val="18"/>
-              </w:rPr>
-              <w:t>tools/web_demo_guard_stress.py --checks duplicate_nonce 或 inflight</w:t>
+            <w:r>
+              <w:t>tools/showcase_guard_stress.py --base-url http://127.0.0.1:7860 --checks duplicate_nonce 或 inflight</w:t>
             </w:r>
           </w:p>
         </w:tc>
@@ -31013,22 +30805,8 @@
             <w:vAlign w:val="center"/>
           </w:tcPr>
           <w:p>
-            <w:pPr>
-              <w:snapToGrid w:val="0"/>
-              <w:ind w:left="0" w:leftChars="0" w:right="0" w:rightChars="0" w:firstLine="0" w:firstLineChars="0"/>
-              <w:jc w:val="center"/>
-              <w:rPr>
-                <w:rFonts w:ascii="宋体" w:eastAsia="宋体"/>
-                <w:sz w:val="18"/>
-              </w:rPr>
-            </w:pPr>
-            <w:r>
-              <w:rPr>
-                <w:rFonts w:ascii="宋体" w:hAnsi="宋体" w:eastAsia="宋体"/>
-                <w:b w:val="0"/>
-                <w:sz w:val="18"/>
-              </w:rPr>
-              <w:t>浏览器重新加载另一张本地样本；或再次运行 tools/web_demo_guard_stress.py</w:t>
+            <w:r>
+              <w:t>浏览器重新加载另一张本地样本；或再次运行 tools/showcase_guard_stress.py</w:t>
             </w:r>
           </w:p>
         </w:tc>
@@ -33098,12 +32876,7 @@
         <w:ind w:firstLine="0"/>
       </w:pPr>
       <w:r>
-        <w:rPr>
-          <w:rFonts w:ascii="宋体" w:hAnsi="宋体" w:eastAsia="宋体"/>
-          <w:b w:val="0"/>
-          <w:sz w:val="24"/>
-        </w:rPr>
-        <w:t>代码位置：web_demo/control_plane_worker.js:142</w:t>
+        <w:t>代码位置：showcase/src/workers/medicalControlPlaneWorker.ts:148</w:t>
       </w:r>
     </w:p>
     <w:p>
@@ -33312,12 +33085,7 @@
         <w:ind w:firstLine="0"/>
       </w:pPr>
       <w:r>
-        <w:rPr>
-          <w:rFonts w:ascii="宋体" w:hAnsi="宋体" w:eastAsia="宋体"/>
-          <w:b w:val="0"/>
-          <w:sz w:val="24"/>
-        </w:rPr>
-        <w:t>代码位置：integrations/openbumblebee/e2e_secure_vit/spu_static_vit.py:639</w:t>
+        <w:t>代码位置：integrations/transshield_runtime/e2e_secure_vit/spu_static_vit.py:639</w:t>
       </w:r>
     </w:p>
     <w:p>
@@ -33660,12 +33428,7 @@
         <w:ind w:firstLine="0"/>
       </w:pPr>
       <w:r>
-        <w:rPr>
-          <w:rFonts w:ascii="宋体" w:hAnsi="宋体" w:eastAsia="宋体"/>
-          <w:b w:val="0"/>
-          <w:sz w:val="24"/>
-        </w:rPr>
-        <w:t>代码位置：tools/transshield_chat_demo.py:2626</w:t>
+        <w:t>代码位置：showcase_api/control_plane.py:309</w:t>
       </w:r>
     </w:p>
     <w:p>
@@ -33906,12 +33669,7 @@
         <w:ind w:firstLine="0"/>
       </w:pPr>
       <w:r>
-        <w:rPr>
-          <w:rFonts w:ascii="宋体" w:hAnsi="宋体" w:eastAsia="宋体"/>
-          <w:b w:val="0"/>
-          <w:sz w:val="24"/>
-        </w:rPr>
-        <w:t>代码位置：tools/web_demo_protocol_fuzz.py:308</w:t>
+        <w:t>代码位置：tools/showcase_protocol_fuzz.py:158</w:t>
       </w:r>
     </w:p>
     <w:p>

</xml_diff>

<commit_message>
Restore report directory subpaths
</commit_message>
<xml_diff>
--- a/docs/密捷竞赛作品报告.docx
+++ b/docs/密捷竞赛作品报告.docx
@@ -14271,7 +14271,17 @@
           </w:tcPr>
           <w:p>
             <w:r>
-              <w:t>showcase/src/app.tsx；showcase/src/workers/medicalControlPlaneWorker.ts；showcase_api/app.py；showcase_api/control_plane.py</w:t>
+              <w:t>showcase/</w:t>
+              <w:br/>
+              <w:t xml:space="preserve">  src/app.tsx</w:t>
+              <w:br/>
+              <w:t xml:space="preserve">  src/workers/medicalControlPlaneWorker.ts</w:t>
+              <w:br/>
+              <w:t>showcase_api/</w:t>
+              <w:br/>
+              <w:t xml:space="preserve">  app.py</w:t>
+              <w:br/>
+              <w:t xml:space="preserve">  control_plane.py</w:t>
             </w:r>
           </w:p>
         </w:tc>
@@ -14372,7 +14382,11 @@
           </w:tcPr>
           <w:p>
             <w:r>
-              <w:t>tools/showcase_protocol_fuzz.py；tools/showcase_guard_stress.py</w:t>
+              <w:t>tools/</w:t>
+              <w:br/>
+              <w:t xml:space="preserve">  showcase_protocol_fuzz.py</w:t>
+              <w:br/>
+              <w:t xml:space="preserve">  showcase_guard_stress.py</w:t>
             </w:r>
           </w:p>
         </w:tc>
@@ -14459,6 +14473,10 @@
           <w:p>
             <w:r>
               <w:t>tools/showcase_extract_report_assets.py</w:t>
+              <w:br/>
+              <w:t>showcase/public/report-assets/</w:t>
+              <w:br/>
+              <w:t>showcase/src/generated/report_content.json</w:t>
             </w:r>
           </w:p>
         </w:tc>

</xml_diff>

<commit_message>
Restore report directory tree section
</commit_message>
<xml_diff>
--- a/docs/密捷竞赛作品报告.docx
+++ b/docs/密捷竞赛作品报告.docx
@@ -14059,6 +14059,76 @@
           <w:right w:w="108" w:type="dxa"/>
         </w:tblCellMar>
       </w:tblPr>
+      <w:tr>
+        <w:tc>
+          <w:tcPr>
+            <w:tcW w:type="dxa" w:w="1168"/>
+          </w:tcPr>
+          <w:p>
+            <w:r>
+              <w:t>当前仓库目录</w:t>
+            </w:r>
+          </w:p>
+        </w:tc>
+        <w:tc>
+          <w:tcPr>
+            <w:tcW w:type="dxa" w:w="5336"/>
+          </w:tcPr>
+          <w:p>
+            <w:r>
+              <w:t>Transshield/</w:t>
+              <w:br/>
+              <w:t>├── showcase/</w:t>
+              <w:br/>
+              <w:t>│   └── src/</w:t>
+              <w:br/>
+              <w:t>├── showcase_api/</w:t>
+              <w:br/>
+              <w:t>├── tools/</w:t>
+              <w:br/>
+              <w:t>│   └── fuzzing/</w:t>
+              <w:br/>
+              <w:t>├── docs/</w:t>
+              <w:br/>
+              <w:t>│   ├── evidence/</w:t>
+              <w:br/>
+              <w:t>│   └── report/</w:t>
+              <w:br/>
+              <w:t>├── results/</w:t>
+              <w:br/>
+              <w:t>│   ├── final/</w:t>
+              <w:br/>
+              <w:t>│   ├── communication/</w:t>
+              <w:br/>
+              <w:t>│   ├── fuzzing/</w:t>
+              <w:br/>
+              <w:t>│   └── guard_stress/</w:t>
+              <w:br/>
+              <w:t>├── artifacts/</w:t>
+              <w:br/>
+              <w:t>├── integrations/</w:t>
+              <w:br/>
+              <w:t>├── models/</w:t>
+              <w:br/>
+              <w:t>├── configs/transshield_runtime/</w:t>
+              <w:br/>
+              <w:t>├── spu_vendored/</w:t>
+              <w:br/>
+              <w:t>└── README_REPRODUCE.md</w:t>
+            </w:r>
+          </w:p>
+        </w:tc>
+        <w:tc>
+          <w:tcPr>
+            <w:tcW w:type="dxa" w:w="2316"/>
+          </w:tcPr>
+          <w:p>
+            <w:r>
+              <w:t>恢复当前交付仓的主目录与关键子目录层级，便于按路径复核前端、后端、证据、脚本与复现说明。</w:t>
+            </w:r>
+          </w:p>
+        </w:tc>
+      </w:tr>
       <w:tblGrid>
         <w:gridCol w:w="1168"/>
         <w:gridCol w:w="5336"/>

</xml_diff>

<commit_message>
Restore report table of contents subentries
</commit_message>
<xml_diff>
--- a/docs/密捷竞赛作品报告.docx
+++ b/docs/密捷竞赛作品报告.docx
@@ -878,126 +878,34 @@
     <w:p>
       <w:pPr>
         <w:pStyle w:val="5"/>
-        <w:tabs>
-          <w:tab w:val="right" w:leader="dot" w:pos="8810"/>
-        </w:tabs>
-        <w:rPr>
-          <w:rFonts w:hint="eastAsia" w:ascii="黑体" w:hAnsi="黑体" w:eastAsia="黑体" w:cs="黑体"/>
-          <w:kern w:val="2"/>
-          <w:sz w:val="28"/>
-          <w:szCs w:val="24"/>
-          <w:lang w:val="en-US" w:eastAsia="zh-CN" w:bidi="ar-SA"/>
-        </w:rPr>
+        <w:ind w:left="360" w:firstLine="0"/>
       </w:pPr>
       <w:r>
-        <w:rPr>
-          <w:rFonts w:hint="eastAsia" w:ascii="黑体" w:hAnsi="黑体" w:eastAsia="黑体" w:cs="黑体"/>
-          <w:kern w:val="2"/>
-          <w:sz w:val="28"/>
-          <w:szCs w:val="24"/>
-          <w:lang w:val="en-US" w:eastAsia="zh-CN" w:bidi="ar-SA"/>
-        </w:rPr>
-        <w:fldChar w:fldCharType="begin"/>
-      </w:r>
-      <w:r>
-        <w:rPr>
-          <w:rFonts w:hint="eastAsia" w:ascii="黑体" w:hAnsi="黑体" w:eastAsia="黑体" w:cs="黑体"/>
-          <w:kern w:val="2"/>
-          <w:sz w:val="28"/>
-          <w:szCs w:val="24"/>
-          <w:lang w:val="en-US" w:eastAsia="zh-CN" w:bidi="ar-SA"/>
-        </w:rPr>
-        <w:instrText xml:space="preserve"> HYPERLINK \l "_Toc33965495" </w:instrText>
-      </w:r>
-      <w:r>
-        <w:rPr>
-          <w:rFonts w:hint="eastAsia" w:ascii="黑体" w:hAnsi="黑体" w:eastAsia="黑体" w:cs="黑体"/>
-          <w:kern w:val="2"/>
-          <w:sz w:val="28"/>
-          <w:szCs w:val="24"/>
-          <w:lang w:val="en-US" w:eastAsia="zh-CN" w:bidi="ar-SA"/>
-        </w:rPr>
-        <w:fldChar w:fldCharType="separate"/>
-      </w:r>
-      <w:r>
-        <w:rPr>
-          <w:rFonts w:hint="eastAsia" w:ascii="黑体" w:hAnsi="黑体" w:eastAsia="黑体" w:cs="黑体"/>
-          <w:kern w:val="2"/>
-          <w:sz w:val="28"/>
-          <w:szCs w:val="24"/>
-          <w:lang w:val="en-US" w:eastAsia="zh-CN" w:bidi="ar-SA"/>
-        </w:rPr>
-        <w:t>第二章 系统设计</w:t>
-      </w:r>
-      <w:r>
-        <w:rPr>
-          <w:rFonts w:hint="eastAsia" w:ascii="黑体" w:hAnsi="黑体" w:eastAsia="黑体" w:cs="黑体"/>
-          <w:kern w:val="2"/>
-          <w:sz w:val="28"/>
-          <w:szCs w:val="24"/>
-          <w:lang w:val="en-US" w:eastAsia="zh-CN" w:bidi="ar-SA"/>
-        </w:rPr>
+        <w:t>1.1 背景与目标</w:t>
         <w:tab/>
-      </w:r>
-      <w:r>
-        <w:rPr>
-          <w:rFonts w:hint="eastAsia" w:ascii="黑体" w:hAnsi="黑体" w:eastAsia="黑体" w:cs="黑体"/>
-          <w:kern w:val="2"/>
-          <w:sz w:val="28"/>
-          <w:szCs w:val="24"/>
-          <w:lang w:val="en-US" w:eastAsia="zh-CN" w:bidi="ar-SA"/>
-        </w:rPr>
-        <w:fldChar w:fldCharType="begin"/>
-      </w:r>
-      <w:r>
-        <w:rPr>
-          <w:rFonts w:hint="eastAsia" w:ascii="黑体" w:hAnsi="黑体" w:eastAsia="黑体" w:cs="黑体"/>
-          <w:kern w:val="2"/>
-          <w:sz w:val="28"/>
-          <w:szCs w:val="24"/>
-          <w:lang w:val="en-US" w:eastAsia="zh-CN" w:bidi="ar-SA"/>
-        </w:rPr>
-        <w:instrText xml:space="preserve"> PAGEREF _Toc33965495 \h </w:instrText>
-      </w:r>
-      <w:r>
-        <w:rPr>
-          <w:rFonts w:hint="eastAsia" w:ascii="黑体" w:hAnsi="黑体" w:eastAsia="黑体" w:cs="黑体"/>
-          <w:kern w:val="2"/>
-          <w:sz w:val="28"/>
-          <w:szCs w:val="24"/>
-          <w:lang w:val="en-US" w:eastAsia="zh-CN" w:bidi="ar-SA"/>
-        </w:rPr>
-        <w:fldChar w:fldCharType="separate"/>
-      </w:r>
-      <w:r>
-        <w:rPr>
-          <w:rFonts w:hint="eastAsia" w:ascii="黑体" w:hAnsi="黑体" w:eastAsia="黑体" w:cs="黑体"/>
-          <w:kern w:val="2"/>
-          <w:sz w:val="28"/>
-          <w:szCs w:val="24"/>
-          <w:lang w:val="en-US" w:eastAsia="zh-CN" w:bidi="ar-SA"/>
-        </w:rPr>
-        <w:t>3</w:t>
-      </w:r>
-      <w:r>
-        <w:rPr>
-          <w:rFonts w:hint="eastAsia" w:ascii="黑体" w:hAnsi="黑体" w:eastAsia="黑体" w:cs="黑体"/>
-          <w:kern w:val="2"/>
-          <w:sz w:val="28"/>
-          <w:szCs w:val="24"/>
-          <w:lang w:val="en-US" w:eastAsia="zh-CN" w:bidi="ar-SA"/>
-        </w:rPr>
-        <w:fldChar w:fldCharType="end"/>
-      </w:r>
-      <w:r>
-        <w:rPr>
-          <w:rFonts w:hint="eastAsia" w:ascii="黑体" w:hAnsi="黑体" w:eastAsia="黑体" w:cs="黑体"/>
-          <w:kern w:val="2"/>
-          <w:sz w:val="28"/>
-          <w:szCs w:val="24"/>
-          <w:lang w:val="en-US" w:eastAsia="zh-CN" w:bidi="ar-SA"/>
-        </w:rPr>
-        <w:fldChar w:fldCharType="end"/>
+        <w:t>2</w:t>
+      </w:r>
+    </w:p>
+    <w:p>
+      <w:pPr>
+        <w:pStyle w:val="5"/>
+        <w:ind w:left="360" w:firstLine="0"/>
+      </w:pPr>
+      <w:r>
+        <w:t>1.2 应用场景与交付边界</w:t>
+        <w:tab/>
+        <w:t>2</w:t>
+      </w:r>
+    </w:p>
+    <w:p>
+      <w:pPr>
+        <w:pStyle w:val="5"/>
+        <w:ind w:left="360" w:firstLine="0"/>
+      </w:pPr>
+      <w:r>
+        <w:t>1.3 核心贡献</w:t>
+        <w:tab/>
+        <w:t>2</w:t>
       </w:r>
     </w:p>
     <w:p>
@@ -1032,7 +940,7 @@
           <w:szCs w:val="24"/>
           <w:lang w:val="en-US" w:eastAsia="zh-CN" w:bidi="ar-SA"/>
         </w:rPr>
-        <w:instrText xml:space="preserve"> HYPERLINK \l "_Toc33965496" </w:instrText>
+        <w:instrText xml:space="preserve"> HYPERLINK \l "_Toc33965495" </w:instrText>
       </w:r>
       <w:r>
         <w:rPr>
@@ -1052,7 +960,7 @@
           <w:szCs w:val="24"/>
           <w:lang w:val="en-US" w:eastAsia="zh-CN" w:bidi="ar-SA"/>
         </w:rPr>
-        <w:t>第三章 系统实现</w:t>
+        <w:t>第二章 系统设计</w:t>
       </w:r>
       <w:r>
         <w:rPr>
@@ -1082,7 +990,7 @@
           <w:szCs w:val="24"/>
           <w:lang w:val="en-US" w:eastAsia="zh-CN" w:bidi="ar-SA"/>
         </w:rPr>
-        <w:instrText xml:space="preserve"> PAGEREF _Toc33965496 \h </w:instrText>
+        <w:instrText xml:space="preserve"> PAGEREF _Toc33965495 \h </w:instrText>
       </w:r>
       <w:r>
         <w:rPr>
@@ -1102,7 +1010,7 @@
           <w:szCs w:val="24"/>
           <w:lang w:val="en-US" w:eastAsia="zh-CN" w:bidi="ar-SA"/>
         </w:rPr>
-        <w:t>4</w:t>
+        <w:t>3</w:t>
       </w:r>
       <w:r>
         <w:rPr>
@@ -1123,6 +1031,61 @@
           <w:lang w:val="en-US" w:eastAsia="zh-CN" w:bidi="ar-SA"/>
         </w:rPr>
         <w:fldChar w:fldCharType="end"/>
+      </w:r>
+    </w:p>
+    <w:p>
+      <w:pPr>
+        <w:pStyle w:val="5"/>
+        <w:ind w:left="360" w:firstLine="0"/>
+      </w:pPr>
+      <w:r>
+        <w:t>2.1 总体架构</w:t>
+        <w:tab/>
+        <w:t>3</w:t>
+      </w:r>
+    </w:p>
+    <w:p>
+      <w:pPr>
+        <w:pStyle w:val="5"/>
+        <w:ind w:left="360" w:firstLine="0"/>
+      </w:pPr>
+      <w:r>
+        <w:t>2.2 威胁模型与安全边界</w:t>
+        <w:tab/>
+        <w:t>3</w:t>
+      </w:r>
+    </w:p>
+    <w:p>
+      <w:pPr>
+        <w:pStyle w:val="5"/>
+        <w:ind w:left="360" w:firstLine="0"/>
+      </w:pPr>
+      <w:r>
+        <w:t>2.3 软件流程</w:t>
+        <w:tab/>
+        <w:t>3</w:t>
+      </w:r>
+    </w:p>
+    <w:p>
+      <w:pPr>
+        <w:pStyle w:val="5"/>
+        <w:ind w:left="360" w:firstLine="0"/>
+      </w:pPr>
+      <w:r>
+        <w:t>2.4 DynamicViT 密态改写</w:t>
+        <w:tab/>
+        <w:t>3</w:t>
+      </w:r>
+    </w:p>
+    <w:p>
+      <w:pPr>
+        <w:pStyle w:val="5"/>
+        <w:ind w:left="360" w:firstLine="0"/>
+      </w:pPr>
+      <w:r>
+        <w:t>2.5 硬件部署与软件基准</w:t>
+        <w:tab/>
+        <w:t>3</w:t>
       </w:r>
     </w:p>
     <w:p>
@@ -1157,7 +1120,7 @@
           <w:szCs w:val="24"/>
           <w:lang w:val="en-US" w:eastAsia="zh-CN" w:bidi="ar-SA"/>
         </w:rPr>
-        <w:instrText xml:space="preserve"> HYPERLINK \l "_Toc33965497" </w:instrText>
+        <w:instrText xml:space="preserve"> HYPERLINK \l "_Toc33965496" </w:instrText>
       </w:r>
       <w:r>
         <w:rPr>
@@ -1177,7 +1140,7 @@
           <w:szCs w:val="24"/>
           <w:lang w:val="en-US" w:eastAsia="zh-CN" w:bidi="ar-SA"/>
         </w:rPr>
-        <w:t>第四章</w:t>
+        <w:t>第三章 系统实现</w:t>
       </w:r>
       <w:r>
         <w:rPr>
@@ -1187,7 +1150,7 @@
           <w:szCs w:val="24"/>
           <w:lang w:val="en-US" w:eastAsia="zh-CN" w:bidi="ar-SA"/>
         </w:rPr>
-        <w:t xml:space="preserve"> 测</w:t>
+        <w:tab/>
       </w:r>
       <w:r>
         <w:rPr>
@@ -1197,7 +1160,7 @@
           <w:szCs w:val="24"/>
           <w:lang w:val="en-US" w:eastAsia="zh-CN" w:bidi="ar-SA"/>
         </w:rPr>
-        <w:t>试方案与结果分析</w:t>
+        <w:fldChar w:fldCharType="begin"/>
       </w:r>
       <w:r>
         <w:rPr>
@@ -1207,7 +1170,7 @@
           <w:szCs w:val="24"/>
           <w:lang w:val="en-US" w:eastAsia="zh-CN" w:bidi="ar-SA"/>
         </w:rPr>
-        <w:tab/>
+        <w:instrText xml:space="preserve"> PAGEREF _Toc33965496 \h </w:instrText>
       </w:r>
       <w:r>
         <w:rPr>
@@ -1217,7 +1180,7 @@
           <w:szCs w:val="24"/>
           <w:lang w:val="en-US" w:eastAsia="zh-CN" w:bidi="ar-SA"/>
         </w:rPr>
-        <w:fldChar w:fldCharType="begin"/>
+        <w:fldChar w:fldCharType="separate"/>
       </w:r>
       <w:r>
         <w:rPr>
@@ -1227,7 +1190,7 @@
           <w:szCs w:val="24"/>
           <w:lang w:val="en-US" w:eastAsia="zh-CN" w:bidi="ar-SA"/>
         </w:rPr>
-        <w:instrText xml:space="preserve"> PAGEREF _Toc33965497 \h </w:instrText>
+        <w:t>4</w:t>
       </w:r>
       <w:r>
         <w:rPr>
@@ -1237,7 +1200,7 @@
           <w:szCs w:val="24"/>
           <w:lang w:val="en-US" w:eastAsia="zh-CN" w:bidi="ar-SA"/>
         </w:rPr>
-        <w:fldChar w:fldCharType="separate"/>
+        <w:fldChar w:fldCharType="end"/>
       </w:r>
       <w:r>
         <w:rPr>
@@ -1247,27 +1210,62 @@
           <w:szCs w:val="24"/>
           <w:lang w:val="en-US" w:eastAsia="zh-CN" w:bidi="ar-SA"/>
         </w:rPr>
-        <w:t>5</w:t>
-      </w:r>
-      <w:r>
-        <w:rPr>
-          <w:rFonts w:hint="eastAsia" w:ascii="黑体" w:hAnsi="黑体" w:eastAsia="黑体" w:cs="黑体"/>
-          <w:kern w:val="2"/>
-          <w:sz w:val="28"/>
-          <w:szCs w:val="24"/>
-          <w:lang w:val="en-US" w:eastAsia="zh-CN" w:bidi="ar-SA"/>
-        </w:rPr>
         <w:fldChar w:fldCharType="end"/>
       </w:r>
-      <w:r>
-        <w:rPr>
-          <w:rFonts w:hint="eastAsia" w:ascii="黑体" w:hAnsi="黑体" w:eastAsia="黑体" w:cs="黑体"/>
-          <w:kern w:val="2"/>
-          <w:sz w:val="28"/>
-          <w:szCs w:val="24"/>
-          <w:lang w:val="en-US" w:eastAsia="zh-CN" w:bidi="ar-SA"/>
-        </w:rPr>
-        <w:fldChar w:fldCharType="end"/>
+    </w:p>
+    <w:p>
+      <w:pPr>
+        <w:pStyle w:val="5"/>
+        <w:ind w:left="360" w:firstLine="0"/>
+      </w:pPr>
+      <w:r>
+        <w:t>3.1 模型改造与两方安全推理链路</w:t>
+        <w:tab/>
+        <w:t>4</w:t>
+      </w:r>
+    </w:p>
+    <w:p>
+      <w:pPr>
+        <w:pStyle w:val="5"/>
+        <w:ind w:left="360" w:firstLine="0"/>
+      </w:pPr>
+      <w:r>
+        <w:t>3.2 端到端执行流程与模块协同</w:t>
+        <w:tab/>
+        <w:t>4</w:t>
+      </w:r>
+    </w:p>
+    <w:p>
+      <w:pPr>
+        <w:pStyle w:val="5"/>
+        <w:ind w:left="360" w:firstLine="0"/>
+      </w:pPr>
+      <w:r>
+        <w:t>3.3 前端控制面实现</w:t>
+        <w:tab/>
+        <w:t>4</w:t>
+      </w:r>
+    </w:p>
+    <w:p>
+      <w:pPr>
+        <w:pStyle w:val="5"/>
+        <w:ind w:left="360" w:firstLine="0"/>
+      </w:pPr>
+      <w:r>
+        <w:t>3.4 服务端权威快检与审计</w:t>
+        <w:tab/>
+        <w:t>4</w:t>
+      </w:r>
+    </w:p>
+    <w:p>
+      <w:pPr>
+        <w:pStyle w:val="5"/>
+        <w:ind w:left="360" w:firstLine="0"/>
+      </w:pPr>
+      <w:r>
+        <w:t>3.5 关键交付物与证据落点</w:t>
+        <w:tab/>
+        <w:t>4</w:t>
       </w:r>
     </w:p>
     <w:p>
@@ -1302,7 +1300,7 @@
           <w:szCs w:val="24"/>
           <w:lang w:val="en-US" w:eastAsia="zh-CN" w:bidi="ar-SA"/>
         </w:rPr>
-        <w:instrText xml:space="preserve"> HYPERLINK \l "_Toc33965498" </w:instrText>
+        <w:instrText xml:space="preserve"> HYPERLINK \l "_Toc33965497" </w:instrText>
       </w:r>
       <w:r>
         <w:rPr>
@@ -1322,7 +1320,7 @@
           <w:szCs w:val="24"/>
           <w:lang w:val="en-US" w:eastAsia="zh-CN" w:bidi="ar-SA"/>
         </w:rPr>
-        <w:t>第五章 创新性与局限性</w:t>
+        <w:t>第四章</w:t>
       </w:r>
       <w:r>
         <w:rPr>
@@ -1332,7 +1330,7 @@
           <w:szCs w:val="24"/>
           <w:lang w:val="en-US" w:eastAsia="zh-CN" w:bidi="ar-SA"/>
         </w:rPr>
-        <w:tab/>
+        <w:t xml:space="preserve"> 测</w:t>
       </w:r>
       <w:r>
         <w:rPr>
@@ -1342,7 +1340,7 @@
           <w:szCs w:val="24"/>
           <w:lang w:val="en-US" w:eastAsia="zh-CN" w:bidi="ar-SA"/>
         </w:rPr>
-        <w:fldChar w:fldCharType="begin"/>
+        <w:t>试方案与结果分析</w:t>
       </w:r>
       <w:r>
         <w:rPr>
@@ -1352,7 +1350,7 @@
           <w:szCs w:val="24"/>
           <w:lang w:val="en-US" w:eastAsia="zh-CN" w:bidi="ar-SA"/>
         </w:rPr>
-        <w:instrText xml:space="preserve"> PAGEREF _Toc33965498 \h </w:instrText>
+        <w:tab/>
       </w:r>
       <w:r>
         <w:rPr>
@@ -1362,7 +1360,7 @@
           <w:szCs w:val="24"/>
           <w:lang w:val="en-US" w:eastAsia="zh-CN" w:bidi="ar-SA"/>
         </w:rPr>
-        <w:fldChar w:fldCharType="separate"/>
+        <w:fldChar w:fldCharType="begin"/>
       </w:r>
       <w:r>
         <w:rPr>
@@ -1372,7 +1370,7 @@
           <w:szCs w:val="24"/>
           <w:lang w:val="en-US" w:eastAsia="zh-CN" w:bidi="ar-SA"/>
         </w:rPr>
-        <w:t>6</w:t>
+        <w:instrText xml:space="preserve"> PAGEREF _Toc33965497 \h </w:instrText>
       </w:r>
       <w:r>
         <w:rPr>
@@ -1382,7 +1380,7 @@
           <w:szCs w:val="24"/>
           <w:lang w:val="en-US" w:eastAsia="zh-CN" w:bidi="ar-SA"/>
         </w:rPr>
-        <w:fldChar w:fldCharType="end"/>
+        <w:fldChar w:fldCharType="separate"/>
       </w:r>
       <w:r>
         <w:rPr>
@@ -1392,7 +1390,104 @@
           <w:szCs w:val="24"/>
           <w:lang w:val="en-US" w:eastAsia="zh-CN" w:bidi="ar-SA"/>
         </w:rPr>
+        <w:t>5</w:t>
+      </w:r>
+      <w:r>
+        <w:rPr>
+          <w:rFonts w:hint="eastAsia" w:ascii="黑体" w:hAnsi="黑体" w:eastAsia="黑体" w:cs="黑体"/>
+          <w:kern w:val="2"/>
+          <w:sz w:val="28"/>
+          <w:szCs w:val="24"/>
+          <w:lang w:val="en-US" w:eastAsia="zh-CN" w:bidi="ar-SA"/>
+        </w:rPr>
         <w:fldChar w:fldCharType="end"/>
+      </w:r>
+      <w:r>
+        <w:rPr>
+          <w:rFonts w:hint="eastAsia" w:ascii="黑体" w:hAnsi="黑体" w:eastAsia="黑体" w:cs="黑体"/>
+          <w:kern w:val="2"/>
+          <w:sz w:val="28"/>
+          <w:szCs w:val="24"/>
+          <w:lang w:val="en-US" w:eastAsia="zh-CN" w:bidi="ar-SA"/>
+        </w:rPr>
+        <w:fldChar w:fldCharType="end"/>
+      </w:r>
+    </w:p>
+    <w:p>
+      <w:pPr>
+        <w:pStyle w:val="5"/>
+        <w:ind w:left="360" w:firstLine="0"/>
+      </w:pPr>
+      <w:r>
+        <w:t>4.1 测试环境、数据与评价指标</w:t>
+        <w:tab/>
+        <w:t>5</w:t>
+      </w:r>
+    </w:p>
+    <w:p>
+      <w:pPr>
+        <w:pStyle w:val="5"/>
+        <w:ind w:left="360" w:firstLine="0"/>
+      </w:pPr>
+      <w:r>
+        <w:t>4.2 基线对比</w:t>
+        <w:tab/>
+        <w:t>5</w:t>
+      </w:r>
+    </w:p>
+    <w:p>
+      <w:pPr>
+        <w:pStyle w:val="5"/>
+        <w:ind w:left="360" w:firstLine="0"/>
+      </w:pPr>
+      <w:r>
+        <w:t>4.3 医疗主要交付场景结果</w:t>
+        <w:tab/>
+        <w:t>5</w:t>
+      </w:r>
+    </w:p>
+    <w:p>
+      <w:pPr>
+        <w:pStyle w:val="5"/>
+        <w:ind w:left="360" w:firstLine="0"/>
+      </w:pPr>
+      <w:r>
+        <w:t>4.4 性能与通信量分析</w:t>
+        <w:tab/>
+        <w:t>5</w:t>
+      </w:r>
+    </w:p>
+    <w:p>
+      <w:pPr>
+        <w:pStyle w:val="5"/>
+        <w:ind w:left="360" w:firstLine="0"/>
+      </w:pPr>
+      <w:r>
+        <w:t>4.5 金融边界压力验证结果</w:t>
+        <w:tab/>
+        <w:t>5</w:t>
+      </w:r>
+    </w:p>
+    <w:p>
+      <w:pPr>
+        <w:pStyle w:val="5"/>
+        <w:ind w:left="360" w:firstLine="0"/>
+      </w:pPr>
+      <w:r>
+        <w:t>4.6 协议层异常输入与鲁棒性验证</w:t>
+        <w:tab/>
+        <w:t>5</w:t>
+      </w:r>
+    </w:p>
+    <w:p>
+      <w:pPr>
+        <w:pStyle w:val="5"/>
+        <w:ind w:left="360" w:firstLine="0"/>
+      </w:pPr>
+      <w:r>
+        <w:t>4.7 结果分析</w:t>
+        <w:tab/>
+        <w:t>5</w:t>
       </w:r>
     </w:p>
     <w:p>
@@ -1402,6 +1497,186 @@
           <w:tab w:val="right" w:leader="dot" w:pos="8810"/>
         </w:tabs>
         <w:rPr>
+          <w:rFonts w:hint="eastAsia" w:ascii="黑体" w:hAnsi="黑体" w:eastAsia="黑体" w:cs="黑体"/>
+          <w:kern w:val="2"/>
+          <w:sz w:val="28"/>
+          <w:szCs w:val="24"/>
+          <w:lang w:val="en-US" w:eastAsia="zh-CN" w:bidi="ar-SA"/>
+        </w:rPr>
+      </w:pPr>
+      <w:r>
+        <w:rPr>
+          <w:rFonts w:hint="eastAsia" w:ascii="黑体" w:hAnsi="黑体" w:eastAsia="黑体" w:cs="黑体"/>
+          <w:kern w:val="2"/>
+          <w:sz w:val="28"/>
+          <w:szCs w:val="24"/>
+          <w:lang w:val="en-US" w:eastAsia="zh-CN" w:bidi="ar-SA"/>
+        </w:rPr>
+        <w:fldChar w:fldCharType="begin"/>
+      </w:r>
+      <w:r>
+        <w:rPr>
+          <w:rFonts w:hint="eastAsia" w:ascii="黑体" w:hAnsi="黑体" w:eastAsia="黑体" w:cs="黑体"/>
+          <w:kern w:val="2"/>
+          <w:sz w:val="28"/>
+          <w:szCs w:val="24"/>
+          <w:lang w:val="en-US" w:eastAsia="zh-CN" w:bidi="ar-SA"/>
+        </w:rPr>
+        <w:instrText xml:space="preserve"> HYPERLINK \l "_Toc33965498" </w:instrText>
+      </w:r>
+      <w:r>
+        <w:rPr>
+          <w:rFonts w:hint="eastAsia" w:ascii="黑体" w:hAnsi="黑体" w:eastAsia="黑体" w:cs="黑体"/>
+          <w:kern w:val="2"/>
+          <w:sz w:val="28"/>
+          <w:szCs w:val="24"/>
+          <w:lang w:val="en-US" w:eastAsia="zh-CN" w:bidi="ar-SA"/>
+        </w:rPr>
+        <w:fldChar w:fldCharType="separate"/>
+      </w:r>
+      <w:r>
+        <w:rPr>
+          <w:rFonts w:hint="eastAsia" w:ascii="黑体" w:hAnsi="黑体" w:eastAsia="黑体" w:cs="黑体"/>
+          <w:kern w:val="2"/>
+          <w:sz w:val="28"/>
+          <w:szCs w:val="24"/>
+          <w:lang w:val="en-US" w:eastAsia="zh-CN" w:bidi="ar-SA"/>
+        </w:rPr>
+        <w:t>第五章 创新性与局限性</w:t>
+      </w:r>
+      <w:r>
+        <w:rPr>
+          <w:rFonts w:hint="eastAsia" w:ascii="黑体" w:hAnsi="黑体" w:eastAsia="黑体" w:cs="黑体"/>
+          <w:kern w:val="2"/>
+          <w:sz w:val="28"/>
+          <w:szCs w:val="24"/>
+          <w:lang w:val="en-US" w:eastAsia="zh-CN" w:bidi="ar-SA"/>
+        </w:rPr>
+        <w:tab/>
+      </w:r>
+      <w:r>
+        <w:rPr>
+          <w:rFonts w:hint="eastAsia" w:ascii="黑体" w:hAnsi="黑体" w:eastAsia="黑体" w:cs="黑体"/>
+          <w:kern w:val="2"/>
+          <w:sz w:val="28"/>
+          <w:szCs w:val="24"/>
+          <w:lang w:val="en-US" w:eastAsia="zh-CN" w:bidi="ar-SA"/>
+        </w:rPr>
+        <w:fldChar w:fldCharType="begin"/>
+      </w:r>
+      <w:r>
+        <w:rPr>
+          <w:rFonts w:hint="eastAsia" w:ascii="黑体" w:hAnsi="黑体" w:eastAsia="黑体" w:cs="黑体"/>
+          <w:kern w:val="2"/>
+          <w:sz w:val="28"/>
+          <w:szCs w:val="24"/>
+          <w:lang w:val="en-US" w:eastAsia="zh-CN" w:bidi="ar-SA"/>
+        </w:rPr>
+        <w:instrText xml:space="preserve"> PAGEREF _Toc33965498 \h </w:instrText>
+      </w:r>
+      <w:r>
+        <w:rPr>
+          <w:rFonts w:hint="eastAsia" w:ascii="黑体" w:hAnsi="黑体" w:eastAsia="黑体" w:cs="黑体"/>
+          <w:kern w:val="2"/>
+          <w:sz w:val="28"/>
+          <w:szCs w:val="24"/>
+          <w:lang w:val="en-US" w:eastAsia="zh-CN" w:bidi="ar-SA"/>
+        </w:rPr>
+        <w:fldChar w:fldCharType="separate"/>
+      </w:r>
+      <w:r>
+        <w:rPr>
+          <w:rFonts w:hint="eastAsia" w:ascii="黑体" w:hAnsi="黑体" w:eastAsia="黑体" w:cs="黑体"/>
+          <w:kern w:val="2"/>
+          <w:sz w:val="28"/>
+          <w:szCs w:val="24"/>
+          <w:lang w:val="en-US" w:eastAsia="zh-CN" w:bidi="ar-SA"/>
+        </w:rPr>
+        <w:t>6</w:t>
+      </w:r>
+      <w:r>
+        <w:rPr>
+          <w:rFonts w:hint="eastAsia" w:ascii="黑体" w:hAnsi="黑体" w:eastAsia="黑体" w:cs="黑体"/>
+          <w:kern w:val="2"/>
+          <w:sz w:val="28"/>
+          <w:szCs w:val="24"/>
+          <w:lang w:val="en-US" w:eastAsia="zh-CN" w:bidi="ar-SA"/>
+        </w:rPr>
+        <w:fldChar w:fldCharType="end"/>
+      </w:r>
+      <w:r>
+        <w:rPr>
+          <w:rFonts w:hint="eastAsia" w:ascii="黑体" w:hAnsi="黑体" w:eastAsia="黑体" w:cs="黑体"/>
+          <w:kern w:val="2"/>
+          <w:sz w:val="28"/>
+          <w:szCs w:val="24"/>
+          <w:lang w:val="en-US" w:eastAsia="zh-CN" w:bidi="ar-SA"/>
+        </w:rPr>
+        <w:fldChar w:fldCharType="end"/>
+      </w:r>
+    </w:p>
+    <w:p>
+      <w:pPr>
+        <w:pStyle w:val="5"/>
+        <w:ind w:left="360" w:firstLine="0"/>
+      </w:pPr>
+      <w:r>
+        <w:t>5.1 算法层创新</w:t>
+        <w:tab/>
+        <w:t>6</w:t>
+      </w:r>
+    </w:p>
+    <w:p>
+      <w:pPr>
+        <w:pStyle w:val="5"/>
+        <w:ind w:left="360" w:firstLine="0"/>
+      </w:pPr>
+      <w:r>
+        <w:t>5.2 系统层创新</w:t>
+        <w:tab/>
+        <w:t>6</w:t>
+      </w:r>
+    </w:p>
+    <w:p>
+      <w:pPr>
+        <w:pStyle w:val="5"/>
+        <w:ind w:left="360" w:firstLine="0"/>
+      </w:pPr>
+      <w:r>
+        <w:t>5.3 工程层特色与可验证交付能力</w:t>
+        <w:tab/>
+        <w:t>6</w:t>
+      </w:r>
+    </w:p>
+    <w:p>
+      <w:pPr>
+        <w:pStyle w:val="5"/>
+        <w:ind w:left="360" w:firstLine="0"/>
+      </w:pPr>
+      <w:r>
+        <w:t>5.4 与常见方案对比</w:t>
+        <w:tab/>
+        <w:t>6</w:t>
+      </w:r>
+    </w:p>
+    <w:p>
+      <w:pPr>
+        <w:pStyle w:val="5"/>
+        <w:ind w:left="360" w:firstLine="0"/>
+      </w:pPr>
+      <w:r>
+        <w:t>5.5 当前局限性</w:t>
+        <w:tab/>
+        <w:t>6</w:t>
+      </w:r>
+    </w:p>
+    <w:p>
+      <w:pPr>
+        <w:pStyle w:val="5"/>
+        <w:tabs>
+          <w:tab w:val="right" w:leader="dot" w:pos="8810"/>
+        </w:tabs>
+        <w:rPr>
           <w:rFonts w:hint="default" w:ascii="黑体" w:hAnsi="黑体" w:eastAsia="黑体" w:cs="黑体"/>
           <w:kern w:val="2"/>
           <w:sz w:val="28"/>
@@ -1418,6 +1693,39 @@
           <w:lang w:val="en-US" w:eastAsia="zh-CN" w:bidi="ar-SA"/>
         </w:rPr>
         <w:t>第六章 复现与参赛说明                                         7</w:t>
+      </w:r>
+    </w:p>
+    <w:p>
+      <w:pPr>
+        <w:pStyle w:val="5"/>
+        <w:ind w:left="360" w:firstLine="0"/>
+      </w:pPr>
+      <w:r>
+        <w:t>6.1 最低可复现路径（可选）</w:t>
+        <w:tab/>
+        <w:t>7</w:t>
+      </w:r>
+    </w:p>
+    <w:p>
+      <w:pPr>
+        <w:pStyle w:val="5"/>
+        <w:ind w:left="360" w:firstLine="0"/>
+      </w:pPr>
+      <w:r>
+        <w:t>6.2 数据、模型与权重合规声明</w:t>
+        <w:tab/>
+        <w:t>7</w:t>
+      </w:r>
+    </w:p>
+    <w:p>
+      <w:pPr>
+        <w:pStyle w:val="5"/>
+        <w:ind w:left="360" w:firstLine="0"/>
+      </w:pPr>
+      <w:r>
+        <w:t>6.3 第三方许可、原创边界与技术公开范围</w:t>
+        <w:tab/>
+        <w:t>7</w:t>
       </w:r>
     </w:p>
     <w:p>

</xml_diff>